<commit_message>
Added include and sorce folders and did intial work on sobol_generator header file
</commit_message>
<xml_diff>
--- a/docs/2D Sobol Stochastic Image Multiplier Implementation Plan.docx
+++ b/docs/2D Sobol Stochastic Image Multiplier Implementation Plan.docx
@@ -1684,6 +1684,110 @@
         <w:spacing/>
         <w:ind/>
         <w:rPr/>
+      </w:pPr>
+      <w:r>
+        <w:rPr>
+          <w:highlight w:val="none"/>
+        </w:rPr>
+      </w:r>
+      <w:r>
+        <w:rPr>
+          <w:highlight w:val="none"/>
+        </w:rPr>
+      </w:r>
+      <w:r>
+        <w:rPr>
+          <w:highlight w:val="none"/>
+        </w:rPr>
+      </w:r>
+    </w:p>
+    <w:p>
+      <w:pPr>
+        <w:pStyle w:val="693"/>
+        <w:pBdr/>
+        <w:spacing/>
+        <w:ind/>
+        <w:rPr>
+          <w:highlight w:val="none"/>
+        </w:rPr>
+      </w:pPr>
+      <w:r>
+        <w:rPr>
+          <w:highlight w:val="none"/>
+        </w:rPr>
+      </w:r>
+      <w:r>
+        <w:rPr>
+          <w:highlight w:val="none"/>
+        </w:rPr>
+      </w:r>
+      <w:r>
+        <w:rPr>
+          <w:highlight w:val="none"/>
+        </w:rPr>
+      </w:r>
+    </w:p>
+    <w:p>
+      <w:pPr>
+        <w:pStyle w:val="693"/>
+        <w:pBdr/>
+        <w:spacing/>
+        <w:ind/>
+        <w:rPr>
+          <w:highlight w:val="none"/>
+        </w:rPr>
+      </w:pPr>
+      <w:r>
+        <w:rPr>
+          <w:highlight w:val="none"/>
+        </w:rPr>
+      </w:r>
+      <w:r>
+        <w:rPr>
+          <w:highlight w:val="none"/>
+        </w:rPr>
+      </w:r>
+      <w:r>
+        <w:rPr>
+          <w:highlight w:val="none"/>
+        </w:rPr>
+      </w:r>
+    </w:p>
+    <w:p>
+      <w:pPr>
+        <w:pStyle w:val="693"/>
+        <w:pBdr/>
+        <w:spacing/>
+        <w:ind/>
+        <w:rPr>
+          <w:highlight w:val="none"/>
+        </w:rPr>
+      </w:pPr>
+      <w:r>
+        <w:rPr>
+          <w:highlight w:val="none"/>
+        </w:rPr>
+      </w:r>
+      <w:r>
+        <w:rPr>
+          <w:highlight w:val="none"/>
+        </w:rPr>
+      </w:r>
+      <w:r>
+        <w:rPr>
+          <w:highlight w:val="none"/>
+        </w:rPr>
+      </w:r>
+    </w:p>
+    <w:p>
+      <w:pPr>
+        <w:pStyle w:val="693"/>
+        <w:pBdr/>
+        <w:spacing/>
+        <w:ind/>
+        <w:rPr>
+          <w:highlight w:val="none"/>
+        </w:rPr>
       </w:pPr>
       <w:r>
         <w:t xml:space="preserve">14. C++ Project Structure</w:t>

</xml_diff>